<commit_message>
docs: sanitize normative artifact paths
</commit_message>
<xml_diff>
--- a/docs/NEOENG_EDITOR_COMPOSICAO_2D_NORMATIVO_2026-08-27.docx
+++ b/docs/NEOENG_EDITOR_COMPOSICAO_2D_NORMATIVO_2026-08-27.docx
@@ -78,7 +78,7 @@
           <w:color w:val="667085"/>
           <w:sz w:val="20"/>
         </w:rPr>
-        <w:t xml:space="preserve"> C:/Users/atnco/Pictures/NeoEng-D-Trace</w:t>
+        <w:t xml:space="preserve"> REPO_ROOT</w:t>
       </w:r>
     </w:p>
     <w:p>
@@ -189,6 +189,28 @@
           <w:sz w:val="20"/>
         </w:rPr>
         <w:t xml:space="preserve"> memo_masthead</w:t>
+      </w:r>
+    </w:p>
+    <w:p>
+      <w:pPr>
+        <w:pStyle w:val="MastheadMetadata"/>
+      </w:pPr>
+      <w:r>
+        <w:rPr>
+          <w:rFonts w:ascii="Calibri" w:hAnsi="Calibri"/>
+          <w:b/>
+          <w:color w:val="667085"/>
+          <w:sz w:val="20"/>
+        </w:rPr>
+        <w:t>Símbolos de caminho:</w:t>
+      </w:r>
+      <w:r>
+        <w:rPr>
+          <w:rFonts w:ascii="Calibri" w:hAnsi="Calibri"/>
+          <w:color w:val="667085"/>
+          <w:sz w:val="20"/>
+        </w:rPr>
+        <w:t xml:space="preserve"> REPO_ROOT significa a raiz local do checkout do repositório; DOWNLOAD_ROOT significa o diretório local destinado a artefatos baixados ou gerados fora do repositório. Os símbolos são deliberadamente usados para evitar vazamento de caminhos de usuário em artefatos versionados.</w:t>
       </w:r>
     </w:p>
     <w:tbl>
@@ -1431,7 +1453,7 @@
                 <w:color w:val="0B2545"/>
                 <w:sz w:val="18"/>
               </w:rPr>
-              <w:t>C:/Users/atnco/Pictures/NeoEng-D-Trace</w:t>
+              <w:t>REPO_ROOT</w:t>
             </w:r>
           </w:p>
         </w:tc>
@@ -1844,7 +1866,7 @@
                 <w:color w:val="0B2545"/>
                 <w:sz w:val="18"/>
               </w:rPr>
-              <w:t>C:/Users/atnco/Pictures/NeoEng-D-Trace/.venv/Scripts/python.exe</w:t>
+              <w:t>REPO_ROOT/.venv/Scripts/python.exe</w:t>
             </w:r>
           </w:p>
         </w:tc>
@@ -2573,7 +2595,7 @@
                 <w:color w:val="0B2545"/>
                 <w:sz w:val="18"/>
               </w:rPr>
-              <w:t>C:/Users/atnco/Downloads/neoeng-conformance-c3-freeze-9b3ab0f.zip</w:t>
+              <w:t>DOWNLOAD_ROOT/neoeng-conformance-c3-freeze-9b3ab0f.zip</w:t>
             </w:r>
           </w:p>
         </w:tc>
@@ -17726,7 +17748,7 @@
           <w:color w:val="0B2545"/>
           <w:sz w:val="22"/>
         </w:rPr>
-        <w:t>Diretório de trabalho: C:/Users/atnco/Pictures/NeoEng-D-Trace Python de qualificação: C:/Users/atnco/Pictures/NeoEng-D-Trace/.venv/Scripts/python.exe</w:t>
+        <w:t>Diretório de trabalho: REPO_ROOT Python de qualificação: REPO_ROOT/.venv/Scripts/python.exe</w:t>
       </w:r>
     </w:p>
     <w:p>

</xml_diff>

<commit_message>
docs(p2d): reconcile composition roadmap and extension governance
</commit_message>
<xml_diff>
--- a/docs/NEOENG_EDITOR_COMPOSICAO_2D_NORMATIVO_2026-08-27.docx
+++ b/docs/NEOENG_EDITOR_COMPOSICAO_2D_NORMATIVO_2026-08-27.docx
@@ -108,21 +108,7 @@
         <w:pStyle w:val="MastheadMetadata"/>
       </w:pPr>
       <w:r>
-        <w:rPr>
-          <w:rFonts w:ascii="Calibri" w:hAnsi="Calibri"/>
-          <w:b/>
-          <w:color w:val="667085"/>
-          <w:sz w:val="20"/>
-        </w:rPr>
-        <w:t>HEAD de referência:</w:t>
-      </w:r>
-      <w:r>
-        <w:rPr>
-          <w:rFonts w:ascii="Calibri" w:hAnsi="Calibri"/>
-          <w:color w:val="667085"/>
-          <w:sz w:val="20"/>
-        </w:rPr>
-        <w:t xml:space="preserve"> 7df73f21f5a609196e6cadac85065c89a989ecb4 — fix(ui): consolidate menu and toolbar integration</w:t>
+        <w:t>HEAD de referência: 4824e7bf7b4a82dbf664485aed6b509c96d59851 — feat(mask-viewer): add isolated polygon editing tools</w:t>
       </w:r>
     </w:p>
     <w:p>
@@ -1561,17 +1547,8 @@
             <w:shd w:fill="FFFFFF" w:val="clear"/>
           </w:tcPr>
           <w:p>
-            <w:pPr>
-              <w:pStyle w:val="TableText"/>
-            </w:pPr>
-            <w:r/>
             <w:r>
-              <w:rPr>
-                <w:rFonts w:ascii="Calibri" w:hAnsi="Calibri"/>
-                <w:color w:val="0B2545"/>
-                <w:sz w:val="18"/>
-              </w:rPr>
-              <w:t>7df73f2</w:t>
+              <w:t>4824e7bf7b4a82dbf664485aed6b509c96d59851</w:t>
             </w:r>
           </w:p>
         </w:tc>
@@ -1620,17 +1597,8 @@
             <w:shd w:fill="FFFFFF" w:val="clear"/>
           </w:tcPr>
           <w:p>
-            <w:pPr>
-              <w:pStyle w:val="TableText"/>
-            </w:pPr>
-            <w:r/>
             <w:r>
-              <w:rPr>
-                <w:rFonts w:ascii="Calibri" w:hAnsi="Calibri"/>
-                <w:color w:val="0B2545"/>
-                <w:sz w:val="18"/>
-              </w:rPr>
-              <w:t>fix(ui): consolidate menu and toolbar integration</w:t>
+              <w:t>feat(mask-viewer): add isolated polygon editing tools</w:t>
             </w:r>
           </w:p>
         </w:tc>
@@ -1652,17 +1620,8 @@
             <w:shd w:fill="FFFFFF" w:val="clear"/>
           </w:tcPr>
           <w:p>
-            <w:pPr>
-              <w:pStyle w:val="TableText"/>
-            </w:pPr>
-            <w:r/>
             <w:r>
-              <w:rPr>
-                <w:rFonts w:ascii="Calibri" w:hAnsi="Calibri"/>
-                <w:color w:val="0B2545"/>
-                <w:sz w:val="18"/>
-              </w:rPr>
-              <w:t>Commit anterior relevante</w:t>
+              <w:t>Integrações anteriores</w:t>
             </w:r>
           </w:p>
         </w:tc>
@@ -1679,17 +1638,8 @@
             <w:shd w:fill="FFFFFF" w:val="clear"/>
           </w:tcPr>
           <w:p>
-            <w:pPr>
-              <w:pStyle w:val="TableText"/>
-            </w:pPr>
-            <w:r/>
             <w:r>
-              <w:rPr>
-                <w:rFonts w:ascii="Calibri" w:hAnsi="Calibri"/>
-                <w:color w:val="0B2545"/>
-                <w:sz w:val="18"/>
-              </w:rPr>
-              <w:t>bb0fc0d — feat(scenario): bind professional document to main preview</w:t>
+              <w:t>bb0fc0d — documento profissional no preview; 7df73f21f5a609196e6cadac85065c89a989ecb4 — menu e toolbar</w:t>
             </w:r>
           </w:p>
         </w:tc>
@@ -2092,17 +2042,8 @@
             <w:shd w:fill="FFFFFF" w:val="clear"/>
           </w:tcPr>
           <w:p>
-            <w:pPr>
-              <w:pStyle w:val="TableText"/>
-            </w:pPr>
-            <w:r/>
             <w:r>
-              <w:rPr>
-                <w:rFonts w:ascii="Calibri" w:hAnsi="Calibri"/>
-                <w:color w:val="0B2545"/>
-                <w:sz w:val="18"/>
-              </w:rPr>
-              <w:t>1758 passed / 2 skipped / 0 failed</w:t>
+              <w:t>1762 passed / 2 skipped / 0 failed</w:t>
             </w:r>
           </w:p>
         </w:tc>
@@ -7148,16 +7089,7 @@
             <w:shd w:fill="FFFFFF" w:val="clear"/>
           </w:tcPr>
           <w:p>
-            <w:pPr>
-              <w:pStyle w:val="TableText"/>
-            </w:pPr>
-            <w:r/>
             <w:r>
-              <w:rPr>
-                <w:rFonts w:ascii="Calibri" w:hAnsi="Calibri"/>
-                <w:color w:val="0B2545"/>
-                <w:sz w:val="18"/>
-              </w:rPr>
               <w:t>Documentação do plano</w:t>
             </w:r>
           </w:p>
@@ -7175,17 +7107,8 @@
             <w:shd w:fill="FFFFFF" w:val="clear"/>
           </w:tcPr>
           <w:p>
-            <w:pPr>
-              <w:pStyle w:val="TableText"/>
-            </w:pPr>
-            <w:r/>
             <w:r>
-              <w:rPr>
-                <w:rFonts w:ascii="Calibri" w:hAnsi="Calibri"/>
-                <w:color w:val="0B2545"/>
-                <w:sz w:val="18"/>
-              </w:rPr>
-              <w:t>precisa de consolidação</w:t>
+              <w:t>reconciliada em P2D-00</w:t>
             </w:r>
           </w:p>
         </w:tc>
@@ -7202,17 +7125,8 @@
             <w:shd w:fill="FFFFFF" w:val="clear"/>
           </w:tcPr>
           <w:p>
-            <w:pPr>
-              <w:pStyle w:val="TableText"/>
-            </w:pPr>
-            <w:r/>
             <w:r>
-              <w:rPr>
-                <w:rFonts w:ascii="Calibri" w:hAnsi="Calibri"/>
-                <w:color w:val="0B2545"/>
-                <w:sz w:val="18"/>
-              </w:rPr>
-              <w:t>plano histórico anterior não refletia os commits bb0fc0d e 7df73f2; este documento passa a ser a referência operacional</w:t>
+              <w:t>Este documento permanece a referência operacional; o registro de reconciliação e o plano de extensões estão em docs/EVIDENCIA_P2D_00_RECONCILIACAO_2026-08-29.md e docs/PLANO_EVOLUCAO_EDITOR_2D_2_5D_3D_E_LINHAS_INDEPENDENTES_2026-08-29.md</w:t>
             </w:r>
           </w:p>
         </w:tc>
@@ -14101,12 +14015,7 @@
     <w:p>
       <w:pPr/>
       <w:r>
-        <w:rPr>
-          <w:rFonts w:ascii="Calibri" w:hAnsi="Calibri"/>
-          <w:color w:val="0B2545"/>
-          <w:sz w:val="22"/>
-        </w:rPr>
-        <w:t>O resultado esperado do último estado conhecido é 1758 passed / 2 skipped / 0 failed, mas esse número é uma referência histórica, não autorização para ignorar testes novos. Se novos testes forem adicionados, o resultado deve ser atualizado e explicado.</w:t>
+        <w:t>O resultado esperado do último estado conhecido é 1762 passed / 2 skipped / 0 failed, mas esse número é uma referência histórica, não autorização para ignorar testes novos. Se novos testes forem adicionados, o resultado deve ser atualizado e explicado.</w:t>
       </w:r>
     </w:p>
     <w:p>
@@ -18835,12 +18744,7 @@
         <w:ind w:left="540" w:hanging="271"/>
       </w:pPr>
       <w:r>
-        <w:rPr>
-          <w:rFonts w:ascii="Calibri" w:hAnsi="Calibri"/>
-          <w:color w:val="0B2545"/>
-          <w:sz w:val="22"/>
-        </w:rPr>
-        <w:t>A integração do menu e toolbar foi consolidada em 7df73f2.</w:t>
+        <w:t>A integração do menu e toolbar foi consolidada em 7df73f2. O editor isolado do visualizador de máscara foi consolidado em 4824e7b. A reconciliação documental P2D-00 foi registrada em docs/EVIDENCIA_P2D_00_RECONCILIACAO_2026-08-29.md.</w:t>
       </w:r>
     </w:p>
     <w:p>
@@ -18882,12 +18786,7 @@
     <w:p>
       <w:pPr/>
       <w:r>
-        <w:rPr>
-          <w:rFonts w:ascii="Calibri" w:hAnsi="Calibri"/>
-          <w:color w:val="0B2545"/>
-          <w:sz w:val="22"/>
-        </w:rPr>
-        <w:t>Após a emissão deste documento, a próxima ação correta não é iniciar uma funcionalidade aleatória nem declarar o editor concluído. É executar a Etapa P2D-00 de reconciliação e, se os valores permanecerem consistentes, abrir a Etapa P2D-01 para resolver a visualização real de assets.</w:t>
+        <w:t>Após a reconciliação P2D-00 registrada em 2026-08-29, a próxima etapa obrigatória é P2D-01: resolver a visualização real de assets, seu ciclo de vida e seus diagnósticos. As linhas de Tilemap, colisão de cenário, NavMesh, entidades/componentes/prefabs e iluminação/VFX permanecem independentes e bloqueadas até o aceite formal de P2D-COMP-01, conforme o plano de extensões.</w:t>
       </w:r>
     </w:p>
     <w:p>

</xml_diff>